<commit_message>
Fix course report text proofing metadata
</commit_message>
<xml_diff>
--- a/docs/course_report/course_report.docx
+++ b/docs/course_report/course_report.docx
@@ -134,7 +134,6 @@
         </w:rPr>
         <w:t xml:space="preserve">Направленность (профиль) программы: Разработка мобильных и </w:t>
       </w:r>
-      <w:proofErr w:type="spellStart"/>
       <w:r>
         <w:rPr>
           <w:rFonts w:cs="Times New Roman"/>
@@ -143,7 +142,6 @@
         </w:rPr>
         <w:t>web</w:t>
       </w:r>
-      <w:proofErr w:type="spellEnd"/>
       <w:r>
         <w:rPr>
           <w:rFonts w:cs="Times New Roman"/>
@@ -314,7 +312,7 @@
           <w:szCs w:val="28"/>
           <w:lang w:val="ru-RU" w:eastAsia="ru-RU"/>
         </w:rPr>
-        <w:t>Выполнил: студент группы CИ-35</w:t>
+        <w:t>Выполнил: студент группы СИ-35</w:t>
       </w:r>
     </w:p>
     <w:p>
@@ -343,7 +341,6 @@
         </w:rPr>
         <w:t xml:space="preserve"> </w:t>
       </w:r>
-      <w:proofErr w:type="gramStart"/>
       <w:r>
         <w:rPr>
           <w:rFonts w:cs="Times New Roman"/>
@@ -360,7 +357,6 @@
         </w:rPr>
         <w:t>.А.</w:t>
       </w:r>
-      <w:proofErr w:type="gramEnd"/>
       <w:r>
         <w:rPr>
           <w:rFonts w:cs="Times New Roman"/>
@@ -516,7 +512,7 @@
           <w:rFonts w:ascii="Times New Roman" w:eastAsia="Times New Roman" w:hAnsi="Times New Roman" w:cstheme="minorBidi"/>
           <w:color w:val="auto"/>
           <w:szCs w:val="22"/>
-          <w:lang w:val="en-US"/>
+          <w:lang w:val="ru-RU"/>
         </w:rPr>
       </w:sdtEndPr>
       <w:sdtContent>
@@ -3247,7 +3243,6 @@
           <w:lang w:val="ru-RU"/>
         </w:rPr>
       </w:pPr>
-      <w:proofErr w:type="gramStart"/>
       <w:r>
         <w:rPr>
           <w:rFonts w:ascii="Consolas" w:eastAsia="Consolas" w:hAnsi="Consolas"/>
@@ -3271,7 +3266,6 @@
         </w:rPr>
         <w:t>2</w:t>
       </w:r>
-      <w:proofErr w:type="gramEnd"/>
       <w:r>
         <w:rPr>
           <w:rFonts w:ascii="Consolas" w:eastAsia="Consolas" w:hAnsi="Consolas"/>
@@ -3280,7 +3274,6 @@
         </w:rPr>
         <w:t>,</w:t>
       </w:r>
-      <w:proofErr w:type="gramStart"/>
       <w:r>
         <w:rPr>
           <w:rFonts w:ascii="Consolas" w:eastAsia="Consolas" w:hAnsi="Consolas"/>
@@ -3289,7 +3282,6 @@
         </w:rPr>
         <w:t>Влажность,Температура</w:t>
       </w:r>
-      <w:proofErr w:type="gramEnd"/>
       <w:r>
         <w:rPr>
           <w:rFonts w:ascii="Consolas" w:eastAsia="Consolas" w:hAnsi="Consolas"/>
@@ -3298,7 +3290,6 @@
         </w:rPr>
         <w:t>,</w:t>
       </w:r>
-      <w:proofErr w:type="gramStart"/>
       <w:r>
         <w:rPr>
           <w:rFonts w:ascii="Consolas" w:eastAsia="Consolas" w:hAnsi="Consolas"/>
@@ -3307,7 +3298,6 @@
         </w:rPr>
         <w:t>Давление,Освещённость</w:t>
       </w:r>
-      <w:proofErr w:type="gramEnd"/>
       <w:r>
         <w:rPr>
           <w:rFonts w:ascii="Consolas" w:eastAsia="Consolas" w:hAnsi="Consolas"/>
@@ -3425,35 +3415,27 @@
       <w:pPr>
         <w:pStyle w:val="a0"/>
       </w:pPr>
-      <w:proofErr w:type="spellStart"/>
       <w:r>
         <w:t>хранить</w:t>
       </w:r>
-      <w:proofErr w:type="spellEnd"/>
       <w:r>
         <w:t xml:space="preserve"> </w:t>
       </w:r>
-      <w:proofErr w:type="spellStart"/>
       <w:r>
         <w:t>полигоны</w:t>
       </w:r>
-      <w:proofErr w:type="spellEnd"/>
       <w:r>
         <w:t xml:space="preserve"> </w:t>
       </w:r>
-      <w:proofErr w:type="spellStart"/>
       <w:r>
         <w:t>экологического</w:t>
       </w:r>
-      <w:proofErr w:type="spellEnd"/>
       <w:r>
         <w:t xml:space="preserve"> </w:t>
       </w:r>
-      <w:proofErr w:type="spellStart"/>
       <w:r>
         <w:t>мониторинга</w:t>
       </w:r>
-      <w:proofErr w:type="spellEnd"/>
       <w:r>
         <w:t>;</w:t>
       </w:r>
@@ -3485,27 +3467,21 @@
       <w:pPr>
         <w:pStyle w:val="a0"/>
       </w:pPr>
-      <w:proofErr w:type="spellStart"/>
       <w:r>
         <w:t>хранить</w:t>
       </w:r>
-      <w:proofErr w:type="spellEnd"/>
       <w:r>
         <w:t xml:space="preserve"> </w:t>
       </w:r>
-      <w:proofErr w:type="spellStart"/>
       <w:r>
         <w:t>единицы</w:t>
       </w:r>
-      <w:proofErr w:type="spellEnd"/>
       <w:r>
         <w:t xml:space="preserve"> </w:t>
       </w:r>
-      <w:proofErr w:type="spellStart"/>
       <w:r>
         <w:t>измерения</w:t>
       </w:r>
-      <w:proofErr w:type="spellEnd"/>
       <w:r>
         <w:t>;</w:t>
       </w:r>
@@ -3577,7 +3553,6 @@
         </w:rPr>
         <w:t xml:space="preserve"> в </w:t>
       </w:r>
-      <w:proofErr w:type="gramStart"/>
       <w:r>
         <w:t>measurements</w:t>
       </w:r>
@@ -3590,7 +3565,6 @@
       <w:r>
         <w:t>import</w:t>
       </w:r>
-      <w:proofErr w:type="gramEnd"/>
       <w:r>
         <w:rPr>
           <w:lang w:val="ru-RU"/>
@@ -3727,27 +3701,21 @@
       <w:pPr>
         <w:pStyle w:val="a0"/>
       </w:pPr>
-      <w:proofErr w:type="spellStart"/>
       <w:r>
         <w:t>просмотр</w:t>
       </w:r>
-      <w:proofErr w:type="spellEnd"/>
       <w:r>
         <w:t xml:space="preserve"> </w:t>
       </w:r>
-      <w:proofErr w:type="spellStart"/>
       <w:r>
         <w:t>сводки</w:t>
       </w:r>
-      <w:proofErr w:type="spellEnd"/>
       <w:r>
         <w:t xml:space="preserve"> </w:t>
       </w:r>
-      <w:proofErr w:type="spellStart"/>
       <w:r>
         <w:t>на</w:t>
       </w:r>
-      <w:proofErr w:type="spellEnd"/>
       <w:r>
         <w:t xml:space="preserve"> Dashboard;</w:t>
       </w:r>
@@ -3779,27 +3747,21 @@
       <w:pPr>
         <w:pStyle w:val="a0"/>
       </w:pPr>
-      <w:proofErr w:type="spellStart"/>
       <w:r>
         <w:t>просмотр</w:t>
       </w:r>
-      <w:proofErr w:type="spellEnd"/>
       <w:r>
         <w:t xml:space="preserve"> </w:t>
       </w:r>
-      <w:proofErr w:type="spellStart"/>
       <w:r>
         <w:t>таблицы</w:t>
       </w:r>
-      <w:proofErr w:type="spellEnd"/>
       <w:r>
         <w:t xml:space="preserve"> </w:t>
       </w:r>
-      <w:proofErr w:type="spellStart"/>
       <w:r>
         <w:t>измерений</w:t>
       </w:r>
-      <w:proofErr w:type="spellEnd"/>
       <w:r>
         <w:t>;</w:t>
       </w:r>
@@ -3992,22 +3954,18 @@
         </w:rPr>
         <w:t xml:space="preserve"> 8, </w:t>
       </w:r>
-      <w:proofErr w:type="spellStart"/>
       <w:r>
         <w:t>FastAPI</w:t>
       </w:r>
-      <w:proofErr w:type="spellEnd"/>
       <w:r>
         <w:rPr>
           <w:lang w:val="ru-RU"/>
         </w:rPr>
         <w:t xml:space="preserve"> с </w:t>
       </w:r>
-      <w:proofErr w:type="spellStart"/>
       <w:r>
         <w:t>SQLAlchemy</w:t>
       </w:r>
-      <w:proofErr w:type="spellEnd"/>
       <w:r>
         <w:rPr>
           <w:lang w:val="ru-RU"/>
@@ -4059,11 +4017,9 @@
         </w:rPr>
         <w:t xml:space="preserve"> </w:t>
       </w:r>
-      <w:proofErr w:type="spellStart"/>
       <w:r>
         <w:t>ECharts</w:t>
       </w:r>
-      <w:proofErr w:type="spellEnd"/>
       <w:r>
         <w:rPr>
           <w:lang w:val="ru-RU"/>
@@ -4174,11 +4130,9 @@
         </w:rPr>
         <w:t xml:space="preserve">поддержка транзакционного механизма </w:t>
       </w:r>
-      <w:proofErr w:type="spellStart"/>
       <w:r>
         <w:t>InnoDB</w:t>
       </w:r>
-      <w:proofErr w:type="spellEnd"/>
       <w:r>
         <w:rPr>
           <w:lang w:val="ru-RU"/>
@@ -4222,7 +4176,6 @@
         </w:rPr>
         <w:t xml:space="preserve"> и </w:t>
       </w:r>
-      <w:proofErr w:type="gramStart"/>
       <w:r>
         <w:t>DECIMAL</w:t>
       </w:r>
@@ -4232,7 +4185,6 @@
         </w:rPr>
         <w:t>(</w:t>
       </w:r>
-      <w:proofErr w:type="gramEnd"/>
       <w:r>
         <w:rPr>
           <w:lang w:val="ru-RU"/>
@@ -4344,11 +4296,9 @@
         </w:rPr>
         <w:t xml:space="preserve">Серверная часть реализована на </w:t>
       </w:r>
-      <w:proofErr w:type="spellStart"/>
       <w:r>
         <w:t>FastAPI</w:t>
       </w:r>
-      <w:proofErr w:type="spellEnd"/>
       <w:r>
         <w:rPr>
           <w:lang w:val="ru-RU"/>
@@ -4420,27 +4370,21 @@
       </w:r>
     </w:p>
     <w:p>
-      <w:proofErr w:type="spellStart"/>
       <w:r>
         <w:t>Преимущества</w:t>
       </w:r>
-      <w:proofErr w:type="spellEnd"/>
       <w:r>
         <w:t xml:space="preserve"> </w:t>
       </w:r>
-      <w:proofErr w:type="spellStart"/>
       <w:r>
         <w:t>выбранного</w:t>
       </w:r>
-      <w:proofErr w:type="spellEnd"/>
       <w:r>
         <w:t xml:space="preserve"> backend-</w:t>
       </w:r>
-      <w:proofErr w:type="spellStart"/>
       <w:r>
         <w:t>стека</w:t>
       </w:r>
-      <w:proofErr w:type="spellEnd"/>
       <w:r>
         <w:t>:</w:t>
       </w:r>
@@ -4452,11 +4396,9 @@
           <w:lang w:val="ru-RU"/>
         </w:rPr>
       </w:pPr>
-      <w:proofErr w:type="spellStart"/>
       <w:r>
         <w:t>Pydantic</w:t>
       </w:r>
-      <w:proofErr w:type="spellEnd"/>
       <w:r>
         <w:rPr>
           <w:lang w:val="ru-RU"/>
@@ -4477,22 +4419,18 @@
         </w:rPr>
         <w:t xml:space="preserve">автоматическая </w:t>
       </w:r>
-      <w:proofErr w:type="spellStart"/>
       <w:r>
         <w:t>OpenAPI</w:t>
       </w:r>
-      <w:proofErr w:type="spellEnd"/>
       <w:r>
         <w:rPr>
           <w:lang w:val="ru-RU"/>
         </w:rPr>
         <w:t xml:space="preserve">-документация </w:t>
       </w:r>
-      <w:proofErr w:type="spellStart"/>
       <w:r>
         <w:t>FastAPI</w:t>
       </w:r>
-      <w:proofErr w:type="spellEnd"/>
       <w:r>
         <w:rPr>
           <w:lang w:val="ru-RU"/>
@@ -4507,11 +4445,9 @@
           <w:lang w:val="ru-RU"/>
         </w:rPr>
       </w:pPr>
-      <w:proofErr w:type="spellStart"/>
       <w:r>
         <w:t>SQLAlchemy</w:t>
       </w:r>
-      <w:proofErr w:type="spellEnd"/>
       <w:r>
         <w:rPr>
           <w:lang w:val="ru-RU"/>
@@ -4616,22 +4552,18 @@
         </w:rPr>
         <w:t xml:space="preserve">Таким образом, </w:t>
       </w:r>
-      <w:proofErr w:type="spellStart"/>
       <w:r>
         <w:t>FastAPI</w:t>
       </w:r>
-      <w:proofErr w:type="spellEnd"/>
       <w:r>
         <w:rPr>
           <w:lang w:val="ru-RU"/>
         </w:rPr>
         <w:t xml:space="preserve">, </w:t>
       </w:r>
-      <w:proofErr w:type="spellStart"/>
       <w:r>
         <w:t>SQLAlchemy</w:t>
       </w:r>
-      <w:proofErr w:type="spellEnd"/>
       <w:r>
         <w:rPr>
           <w:lang w:val="ru-RU"/>
@@ -4763,27 +4695,21 @@
       </w:r>
     </w:p>
     <w:p>
-      <w:proofErr w:type="spellStart"/>
       <w:r>
         <w:t>Преимущества</w:t>
       </w:r>
-      <w:proofErr w:type="spellEnd"/>
       <w:r>
         <w:t xml:space="preserve"> </w:t>
       </w:r>
-      <w:proofErr w:type="spellStart"/>
       <w:r>
         <w:t>выбранного</w:t>
       </w:r>
-      <w:proofErr w:type="spellEnd"/>
       <w:r>
         <w:t xml:space="preserve"> frontend-</w:t>
       </w:r>
-      <w:proofErr w:type="spellStart"/>
       <w:r>
         <w:t>стека</w:t>
       </w:r>
-      <w:proofErr w:type="spellEnd"/>
       <w:r>
         <w:t>:</w:t>
       </w:r>
@@ -4885,11 +4811,9 @@
         </w:rPr>
         <w:t xml:space="preserve"> </w:t>
       </w:r>
-      <w:proofErr w:type="spellStart"/>
       <w:r>
         <w:t>ECharts</w:t>
       </w:r>
-      <w:proofErr w:type="spellEnd"/>
       <w:r>
         <w:rPr>
           <w:lang w:val="ru-RU"/>
@@ -4932,11 +4856,9 @@
         </w:rPr>
         <w:t xml:space="preserve"> отвечает за надежное хранение нормализованных данных, </w:t>
       </w:r>
-      <w:proofErr w:type="spellStart"/>
       <w:r>
         <w:t>FastAPI</w:t>
       </w:r>
-      <w:proofErr w:type="spellEnd"/>
       <w:r>
         <w:rPr>
           <w:lang w:val="ru-RU"/>
@@ -5036,59 +4958,45 @@
       <w:r>
         <w:t xml:space="preserve"> </w:t>
       </w:r>
-      <w:proofErr w:type="spellStart"/>
       <w:r>
         <w:t>выделены</w:t>
       </w:r>
-      <w:proofErr w:type="spellEnd"/>
       <w:r>
         <w:t xml:space="preserve"> </w:t>
       </w:r>
-      <w:proofErr w:type="spellStart"/>
       <w:r>
         <w:t>шесть</w:t>
       </w:r>
-      <w:proofErr w:type="spellEnd"/>
       <w:r>
         <w:t xml:space="preserve"> </w:t>
       </w:r>
-      <w:proofErr w:type="spellStart"/>
       <w:r>
         <w:t>таблиц</w:t>
       </w:r>
-      <w:proofErr w:type="spellEnd"/>
       <w:r>
         <w:t xml:space="preserve">: polygons, </w:t>
       </w:r>
-      <w:proofErr w:type="spellStart"/>
       <w:r>
         <w:t>data_collectors</w:t>
       </w:r>
-      <w:proofErr w:type="spellEnd"/>
       <w:r>
         <w:t xml:space="preserve">, </w:t>
       </w:r>
-      <w:proofErr w:type="spellStart"/>
       <w:r>
         <w:t>measurement_units</w:t>
       </w:r>
-      <w:proofErr w:type="spellEnd"/>
       <w:r>
         <w:t xml:space="preserve">, </w:t>
       </w:r>
-      <w:proofErr w:type="spellStart"/>
       <w:r>
         <w:t>sensor_types</w:t>
       </w:r>
-      <w:proofErr w:type="spellEnd"/>
       <w:r>
         <w:t xml:space="preserve">, </w:t>
       </w:r>
-      <w:proofErr w:type="spellStart"/>
       <w:r>
         <w:t>import_files</w:t>
       </w:r>
-      <w:proofErr w:type="spellEnd"/>
       <w:r>
         <w:t xml:space="preserve"> </w:t>
       </w:r>
@@ -5146,14 +5054,12 @@
         </w:rPr>
         <w:t xml:space="preserve">Таблица </w:t>
       </w:r>
-      <w:proofErr w:type="spellStart"/>
       <w:r>
         <w:rPr>
           <w:lang w:val="ru-RU"/>
         </w:rPr>
         <w:t>polygons</w:t>
       </w:r>
-      <w:proofErr w:type="spellEnd"/>
       <w:r>
         <w:rPr>
           <w:lang w:val="ru-RU"/>
@@ -5215,7 +5121,6 @@
               <w:ind w:firstLine="0"/>
               <w:jc w:val="center"/>
             </w:pPr>
-            <w:proofErr w:type="spellStart"/>
             <w:r>
               <w:rPr>
                 <w:b/>
@@ -5223,7 +5128,6 @@
               </w:rPr>
               <w:t>Поле</w:t>
             </w:r>
-            <w:proofErr w:type="spellEnd"/>
           </w:p>
         </w:tc>
         <w:tc>
@@ -5704,14 +5608,12 @@
               <w:ind w:firstLine="0"/>
               <w:jc w:val="left"/>
             </w:pPr>
-            <w:proofErr w:type="spellStart"/>
             <w:r>
               <w:rPr>
                 <w:sz w:val="19"/>
               </w:rPr>
               <w:t>updated_at</w:t>
             </w:r>
-            <w:proofErr w:type="spellEnd"/>
           </w:p>
         </w:tc>
         <w:tc>
@@ -5791,7 +5693,6 @@
         </w:rPr>
         <w:t xml:space="preserve">Таблица </w:t>
       </w:r>
-      <w:proofErr w:type="spellStart"/>
       <w:r>
         <w:rPr>
           <w:lang w:val="ru-RU"/>
@@ -5810,7 +5711,6 @@
         </w:rPr>
         <w:t>collectors</w:t>
       </w:r>
-      <w:proofErr w:type="spellEnd"/>
       <w:r>
         <w:rPr>
           <w:lang w:val="ru-RU"/>
@@ -6140,14 +6040,12 @@
               <w:ind w:firstLine="0"/>
               <w:jc w:val="left"/>
             </w:pPr>
-            <w:proofErr w:type="spellStart"/>
             <w:r>
               <w:rPr>
                 <w:sz w:val="19"/>
               </w:rPr>
               <w:t>first_name</w:t>
             </w:r>
-            <w:proofErr w:type="spellEnd"/>
           </w:p>
         </w:tc>
         <w:tc>
@@ -6226,14 +6124,12 @@
               <w:ind w:firstLine="0"/>
               <w:jc w:val="left"/>
             </w:pPr>
-            <w:proofErr w:type="spellStart"/>
             <w:r>
               <w:rPr>
                 <w:sz w:val="19"/>
               </w:rPr>
               <w:t>middle_name</w:t>
             </w:r>
-            <w:proofErr w:type="spellEnd"/>
           </w:p>
         </w:tc>
         <w:tc>
@@ -6312,14 +6208,12 @@
               <w:ind w:firstLine="0"/>
               <w:jc w:val="left"/>
             </w:pPr>
-            <w:proofErr w:type="spellStart"/>
             <w:r>
               <w:rPr>
                 <w:sz w:val="19"/>
               </w:rPr>
               <w:t>created_at</w:t>
             </w:r>
-            <w:proofErr w:type="spellEnd"/>
           </w:p>
         </w:tc>
         <w:tc>
@@ -6400,7 +6294,6 @@
         <w:lastRenderedPageBreak/>
         <w:t xml:space="preserve">Таблица </w:t>
       </w:r>
-      <w:proofErr w:type="spellStart"/>
       <w:r>
         <w:rPr>
           <w:lang w:val="ru-RU"/>
@@ -6419,7 +6312,6 @@
         </w:rPr>
         <w:t>units</w:t>
       </w:r>
-      <w:proofErr w:type="spellEnd"/>
       <w:r>
         <w:rPr>
           <w:lang w:val="ru-RU"/>
@@ -6806,14 +6698,12 @@
               </w:rPr>
               <w:t xml:space="preserve">, </w:t>
             </w:r>
-            <w:proofErr w:type="spellStart"/>
             <w:r>
               <w:rPr>
                 <w:sz w:val="19"/>
               </w:rPr>
               <w:t>hPa</w:t>
             </w:r>
-            <w:proofErr w:type="spellEnd"/>
             <w:r>
               <w:rPr>
                 <w:sz w:val="19"/>
@@ -6918,7 +6808,6 @@
         </w:rPr>
         <w:t xml:space="preserve">Таблица </w:t>
       </w:r>
-      <w:proofErr w:type="spellStart"/>
       <w:r>
         <w:rPr>
           <w:lang w:val="ru-RU"/>
@@ -6937,7 +6826,6 @@
         </w:rPr>
         <w:t>types</w:t>
       </w:r>
-      <w:proofErr w:type="spellEnd"/>
       <w:r>
         <w:rPr>
           <w:lang w:val="ru-RU"/>
@@ -6962,11 +6850,9 @@
       <w:r>
         <w:t xml:space="preserve"> </w:t>
       </w:r>
-      <w:proofErr w:type="spellStart"/>
       <w:r>
         <w:t>sensor_types</w:t>
       </w:r>
-      <w:proofErr w:type="spellEnd"/>
       <w:r>
         <w:t>:</w:t>
       </w:r>
@@ -7534,11 +7420,9 @@
       <w:r>
         <w:t xml:space="preserve"> </w:t>
       </w:r>
-      <w:proofErr w:type="spellStart"/>
       <w:r>
         <w:t>import_files</w:t>
       </w:r>
-      <w:proofErr w:type="spellEnd"/>
       <w:r>
         <w:t xml:space="preserve"> </w:t>
       </w:r>
@@ -7578,27 +7462,21 @@
       <w:r>
         <w:t xml:space="preserve">. </w:t>
       </w:r>
-      <w:proofErr w:type="spellStart"/>
       <w:r>
         <w:t>Поля</w:t>
       </w:r>
-      <w:proofErr w:type="spellEnd"/>
       <w:r>
         <w:t xml:space="preserve"> </w:t>
       </w:r>
-      <w:proofErr w:type="spellStart"/>
       <w:r>
         <w:t>таблицы</w:t>
       </w:r>
-      <w:proofErr w:type="spellEnd"/>
       <w:r>
         <w:t xml:space="preserve"> </w:t>
       </w:r>
-      <w:proofErr w:type="spellStart"/>
       <w:r>
         <w:t>import_files</w:t>
       </w:r>
-      <w:proofErr w:type="spellEnd"/>
       <w:r>
         <w:t>:</w:t>
       </w:r>
@@ -7896,14 +7774,12 @@
               <w:ind w:firstLine="0"/>
               <w:jc w:val="left"/>
             </w:pPr>
-            <w:proofErr w:type="spellStart"/>
             <w:r>
               <w:rPr>
                 <w:sz w:val="19"/>
               </w:rPr>
               <w:t>collector_id</w:t>
             </w:r>
-            <w:proofErr w:type="spellEnd"/>
           </w:p>
         </w:tc>
         <w:tc>
@@ -8142,14 +8018,12 @@
               <w:ind w:firstLine="0"/>
               <w:jc w:val="left"/>
             </w:pPr>
-            <w:proofErr w:type="spellStart"/>
             <w:r>
               <w:rPr>
                 <w:sz w:val="19"/>
               </w:rPr>
               <w:t>rows_count</w:t>
             </w:r>
-            <w:proofErr w:type="spellEnd"/>
           </w:p>
         </w:tc>
         <w:tc>
@@ -8470,14 +8344,12 @@
         </w:rPr>
         <w:t xml:space="preserve">Таблица </w:t>
       </w:r>
-      <w:proofErr w:type="spellStart"/>
       <w:r>
         <w:rPr>
           <w:lang w:val="ru-RU"/>
         </w:rPr>
         <w:t>measurements</w:t>
       </w:r>
-      <w:proofErr w:type="spellEnd"/>
       <w:r>
         <w:rPr>
           <w:lang w:val="ru-RU"/>
@@ -8789,14 +8661,12 @@
               <w:ind w:firstLine="0"/>
               <w:jc w:val="left"/>
             </w:pPr>
-            <w:proofErr w:type="spellStart"/>
             <w:r>
               <w:rPr>
                 <w:sz w:val="19"/>
               </w:rPr>
               <w:t>sensor_type_id</w:t>
             </w:r>
-            <w:proofErr w:type="spellEnd"/>
           </w:p>
         </w:tc>
         <w:tc>
@@ -9054,14 +8924,12 @@
               <w:ind w:firstLine="0"/>
               <w:jc w:val="left"/>
             </w:pPr>
-            <w:proofErr w:type="spellStart"/>
             <w:r>
               <w:rPr>
                 <w:sz w:val="19"/>
               </w:rPr>
               <w:t>measured_at</w:t>
             </w:r>
-            <w:proofErr w:type="spellEnd"/>
           </w:p>
         </w:tc>
         <w:tc>
@@ -9331,14 +9199,12 @@
         </w:rPr>
         <w:t xml:space="preserve"> с </w:t>
       </w:r>
-      <w:proofErr w:type="spellStart"/>
       <w:r>
         <w:rPr>
           <w:lang w:val="ru-RU"/>
         </w:rPr>
         <w:t>автоинкрементом</w:t>
       </w:r>
-      <w:proofErr w:type="spellEnd"/>
       <w:r>
         <w:rPr>
           <w:lang w:val="ru-RU"/>
@@ -9372,7 +9238,6 @@
         </w:rPr>
         <w:t xml:space="preserve">, для числовых значений измерений — </w:t>
       </w:r>
-      <w:proofErr w:type="gramStart"/>
       <w:r>
         <w:t>DECIMAL</w:t>
       </w:r>
@@ -9382,7 +9247,6 @@
         </w:rPr>
         <w:t>(</w:t>
       </w:r>
-      <w:proofErr w:type="gramEnd"/>
       <w:r>
         <w:rPr>
           <w:lang w:val="ru-RU"/>
@@ -9399,28 +9263,22 @@
         <w:lastRenderedPageBreak/>
         <w:t>3.3. ER-</w:t>
       </w:r>
-      <w:proofErr w:type="spellStart"/>
       <w:r>
         <w:t>диаграмма</w:t>
       </w:r>
-      <w:proofErr w:type="spellEnd"/>
       <w:r>
         <w:t xml:space="preserve"> </w:t>
       </w:r>
-      <w:proofErr w:type="spellStart"/>
       <w:r>
         <w:t>базы</w:t>
       </w:r>
-      <w:proofErr w:type="spellEnd"/>
       <w:r>
         <w:t xml:space="preserve"> </w:t>
       </w:r>
-      <w:proofErr w:type="spellStart"/>
       <w:r>
         <w:t>данных</w:t>
       </w:r>
       <w:bookmarkEnd w:id="13"/>
-      <w:proofErr w:type="spellEnd"/>
     </w:p>
     <w:p>
       <w:pPr>
@@ -9739,14 +9597,12 @@
         </w:rPr>
         <w:t xml:space="preserve"> является наиболее крупной таблицей, поэтому в модели заданы составные индексы для основных сценариев выборки. Индекс </w:t>
       </w:r>
-      <w:proofErr w:type="spellStart"/>
       <w:r>
         <w:rPr>
           <w:lang w:val="ru-RU"/>
         </w:rPr>
         <w:t>idx</w:t>
       </w:r>
-      <w:proofErr w:type="spellEnd"/>
       <w:r>
         <w:rPr>
           <w:lang w:val="ru-RU"/>
@@ -9801,14 +9657,12 @@
         </w:rPr>
         <w:t xml:space="preserve"> используется при фильтрации по полигону, типу показателя и периоду. Индекс </w:t>
       </w:r>
-      <w:proofErr w:type="spellStart"/>
       <w:r>
         <w:rPr>
           <w:lang w:val="ru-RU"/>
         </w:rPr>
         <w:t>idx</w:t>
       </w:r>
-      <w:proofErr w:type="spellEnd"/>
       <w:r>
         <w:rPr>
           <w:lang w:val="ru-RU"/>
@@ -9863,14 +9717,12 @@
         </w:rPr>
         <w:t xml:space="preserve"> полезен при сравнении одного показателя на нескольких полигонах. Индекс </w:t>
       </w:r>
-      <w:proofErr w:type="spellStart"/>
       <w:r>
         <w:rPr>
           <w:lang w:val="ru-RU"/>
         </w:rPr>
         <w:t>idx</w:t>
       </w:r>
-      <w:proofErr w:type="spellEnd"/>
       <w:r>
         <w:rPr>
           <w:lang w:val="ru-RU"/>
@@ -9901,14 +9753,12 @@
         </w:rPr>
         <w:t xml:space="preserve"> ускоряет выборки по периоду, а </w:t>
       </w:r>
-      <w:proofErr w:type="spellStart"/>
       <w:r>
         <w:rPr>
           <w:lang w:val="ru-RU"/>
         </w:rPr>
         <w:t>idx</w:t>
       </w:r>
-      <w:proofErr w:type="spellEnd"/>
       <w:r>
         <w:rPr>
           <w:lang w:val="ru-RU"/>
@@ -9964,14 +9814,12 @@
         </w:rPr>
         <w:t xml:space="preserve">Для журнала загрузок задан индекс </w:t>
       </w:r>
-      <w:proofErr w:type="spellStart"/>
       <w:r>
         <w:rPr>
           <w:lang w:val="ru-RU"/>
         </w:rPr>
         <w:t>idx</w:t>
       </w:r>
-      <w:proofErr w:type="spellEnd"/>
       <w:r>
         <w:rPr>
           <w:lang w:val="ru-RU"/>
@@ -10026,7 +9874,6 @@
         </w:rPr>
         <w:t xml:space="preserve">, который ускоряет просмотр импортов по полигону и дате загрузки. Для справочника загрузивших используется индекс по фамилии, так как при импорте система ищет существующую запись по </w:t>
       </w:r>
-      <w:proofErr w:type="spellStart"/>
       <w:r>
         <w:rPr>
           <w:lang w:val="ru-RU"/>
@@ -10045,7 +9892,6 @@
         </w:rPr>
         <w:t>name</w:t>
       </w:r>
-      <w:proofErr w:type="spellEnd"/>
       <w:r>
         <w:rPr>
           <w:lang w:val="ru-RU"/>
@@ -10099,11 +9945,9 @@
         </w:rPr>
         <w:t xml:space="preserve">Серверная часть реализована на </w:t>
       </w:r>
-      <w:proofErr w:type="spellStart"/>
       <w:r>
         <w:t>FastAPI</w:t>
       </w:r>
-      <w:proofErr w:type="spellEnd"/>
       <w:r>
         <w:rPr>
           <w:lang w:val="ru-RU"/>
@@ -10128,22 +9972,18 @@
         </w:rPr>
         <w:t xml:space="preserve">, проверяет входные данные через </w:t>
       </w:r>
-      <w:proofErr w:type="spellStart"/>
       <w:r>
         <w:t>Pydantic</w:t>
       </w:r>
-      <w:proofErr w:type="spellEnd"/>
       <w:r>
         <w:rPr>
           <w:lang w:val="ru-RU"/>
         </w:rPr>
         <w:t xml:space="preserve">-схемы, выполняет операции через </w:t>
       </w:r>
-      <w:proofErr w:type="spellStart"/>
       <w:r>
         <w:t>SQLAlchemy</w:t>
       </w:r>
-      <w:proofErr w:type="spellEnd"/>
       <w:r>
         <w:rPr>
           <w:lang w:val="ru-RU"/>
@@ -10285,11 +10125,9 @@
         </w:rPr>
         <w:t>.</w:t>
       </w:r>
-      <w:proofErr w:type="spellStart"/>
       <w:r>
         <w:t>py</w:t>
       </w:r>
-      <w:proofErr w:type="spellEnd"/>
       <w:r>
         <w:rPr>
           <w:lang w:val="ru-RU"/>
@@ -10332,11 +10170,9 @@
         </w:rPr>
         <w:t>.</w:t>
       </w:r>
-      <w:proofErr w:type="spellStart"/>
       <w:r>
         <w:t>py</w:t>
       </w:r>
-      <w:proofErr w:type="spellEnd"/>
       <w:r>
         <w:rPr>
           <w:lang w:val="ru-RU"/>
@@ -10379,7 +10215,6 @@
         <w:ind w:left="142" w:right="57" w:firstLine="0"/>
         <w:jc w:val="left"/>
       </w:pPr>
-      <w:proofErr w:type="gramStart"/>
       <w:r>
         <w:rPr>
           <w:rFonts w:ascii="Consolas" w:eastAsia="Consolas" w:hAnsi="Consolas"/>
@@ -10387,7 +10222,6 @@
         </w:rPr>
         <w:t>@property</w:t>
       </w:r>
-      <w:proofErr w:type="gramEnd"/>
     </w:p>
     <w:p>
       <w:pPr>
@@ -10773,7 +10607,6 @@
         <w:ind w:left="142" w:right="57" w:firstLine="0"/>
         <w:jc w:val="left"/>
       </w:pPr>
-      <w:proofErr w:type="spellStart"/>
       <w:r>
         <w:rPr>
           <w:rFonts w:ascii="Consolas" w:eastAsia="Consolas" w:hAnsi="Consolas"/>
@@ -10781,7 +10614,6 @@
         </w:rPr>
         <w:t>base_stmt</w:t>
       </w:r>
-      <w:proofErr w:type="spellEnd"/>
       <w:r>
         <w:rPr>
           <w:rFonts w:ascii="Consolas" w:eastAsia="Consolas" w:hAnsi="Consolas"/>
@@ -11142,7 +10974,6 @@
         <w:ind w:left="142" w:right="57" w:firstLine="0"/>
         <w:jc w:val="left"/>
       </w:pPr>
-      <w:proofErr w:type="spellStart"/>
       <w:r>
         <w:rPr>
           <w:rFonts w:ascii="Consolas" w:eastAsia="Consolas" w:hAnsi="Consolas"/>
@@ -11150,7 +10981,6 @@
         </w:rPr>
         <w:t>sensor_type</w:t>
       </w:r>
-      <w:proofErr w:type="spellEnd"/>
       <w:r>
         <w:rPr>
           <w:rFonts w:ascii="Consolas" w:eastAsia="Consolas" w:hAnsi="Consolas"/>
@@ -11158,8 +10988,6 @@
         </w:rPr>
         <w:t xml:space="preserve"> = </w:t>
       </w:r>
-      <w:proofErr w:type="spellStart"/>
-      <w:proofErr w:type="gramStart"/>
       <w:r>
         <w:rPr>
           <w:rFonts w:ascii="Consolas" w:eastAsia="Consolas" w:hAnsi="Consolas"/>
@@ -11167,7 +10995,6 @@
         </w:rPr>
         <w:t>db.get</w:t>
       </w:r>
-      <w:proofErr w:type="spellEnd"/>
       <w:r>
         <w:rPr>
           <w:rFonts w:ascii="Consolas" w:eastAsia="Consolas" w:hAnsi="Consolas"/>
@@ -11175,8 +11002,6 @@
         </w:rPr>
         <w:t>(</w:t>
       </w:r>
-      <w:proofErr w:type="spellStart"/>
-      <w:proofErr w:type="gramEnd"/>
       <w:r>
         <w:rPr>
           <w:rFonts w:ascii="Consolas" w:eastAsia="Consolas" w:hAnsi="Consolas"/>
@@ -11184,7 +11009,6 @@
         </w:rPr>
         <w:t>SensorType</w:t>
       </w:r>
-      <w:proofErr w:type="spellEnd"/>
       <w:r>
         <w:rPr>
           <w:rFonts w:ascii="Consolas" w:eastAsia="Consolas" w:hAnsi="Consolas"/>
@@ -11192,8 +11016,6 @@
         </w:rPr>
         <w:t xml:space="preserve">, </w:t>
       </w:r>
-      <w:proofErr w:type="spellStart"/>
-      <w:proofErr w:type="gramStart"/>
       <w:r>
         <w:rPr>
           <w:rFonts w:ascii="Consolas" w:eastAsia="Consolas" w:hAnsi="Consolas"/>
@@ -11201,7 +11023,6 @@
         </w:rPr>
         <w:t>payload.sensor</w:t>
       </w:r>
-      <w:proofErr w:type="gramEnd"/>
       <w:r>
         <w:rPr>
           <w:rFonts w:ascii="Consolas" w:eastAsia="Consolas" w:hAnsi="Consolas"/>
@@ -11209,7 +11030,6 @@
         </w:rPr>
         <w:t>_type_id</w:t>
       </w:r>
-      <w:proofErr w:type="spellEnd"/>
       <w:r>
         <w:rPr>
           <w:rFonts w:ascii="Consolas" w:eastAsia="Consolas" w:hAnsi="Consolas"/>
@@ -11449,8 +11269,6 @@
         <w:ind w:left="142" w:right="57" w:firstLine="0"/>
         <w:jc w:val="left"/>
       </w:pPr>
-      <w:proofErr w:type="spellStart"/>
-      <w:proofErr w:type="gramStart"/>
       <w:r>
         <w:rPr>
           <w:rFonts w:ascii="Consolas" w:eastAsia="Consolas" w:hAnsi="Consolas"/>
@@ -11473,7 +11291,6 @@
         </w:rPr>
         <w:t>polygon</w:t>
       </w:r>
-      <w:proofErr w:type="gramEnd"/>
       <w:r>
         <w:rPr>
           <w:rFonts w:ascii="Consolas" w:eastAsia="Consolas" w:hAnsi="Consolas"/>
@@ -11488,7 +11305,6 @@
         </w:rPr>
         <w:t>id</w:t>
       </w:r>
-      <w:proofErr w:type="spellEnd"/>
       <w:r>
         <w:rPr>
           <w:rFonts w:ascii="Consolas" w:eastAsia="Consolas" w:hAnsi="Consolas"/>
@@ -11496,8 +11312,6 @@
         </w:rPr>
         <w:t xml:space="preserve"> = </w:t>
       </w:r>
-      <w:proofErr w:type="spellStart"/>
-      <w:proofErr w:type="gramStart"/>
       <w:r>
         <w:rPr>
           <w:rFonts w:ascii="Consolas" w:eastAsia="Consolas" w:hAnsi="Consolas"/>
@@ -11519,7 +11333,6 @@
         </w:rPr>
         <w:t>polygon</w:t>
       </w:r>
-      <w:proofErr w:type="gramEnd"/>
       <w:r>
         <w:rPr>
           <w:rFonts w:ascii="Consolas" w:eastAsia="Consolas" w:hAnsi="Consolas"/>
@@ -11534,7 +11347,6 @@
         </w:rPr>
         <w:t>id</w:t>
       </w:r>
-      <w:proofErr w:type="spellEnd"/>
     </w:p>
     <w:p>
       <w:pPr>
@@ -11543,8 +11355,6 @@
         <w:ind w:left="142" w:right="57" w:firstLine="0"/>
         <w:jc w:val="left"/>
       </w:pPr>
-      <w:proofErr w:type="spellStart"/>
-      <w:proofErr w:type="gramStart"/>
       <w:r>
         <w:rPr>
           <w:rFonts w:ascii="Consolas" w:eastAsia="Consolas" w:hAnsi="Consolas"/>
@@ -11552,7 +11362,6 @@
         </w:rPr>
         <w:t>measurement.sensor</w:t>
       </w:r>
-      <w:proofErr w:type="gramEnd"/>
       <w:r>
         <w:rPr>
           <w:rFonts w:ascii="Consolas" w:eastAsia="Consolas" w:hAnsi="Consolas"/>
@@ -11560,7 +11369,6 @@
         </w:rPr>
         <w:t>_type_id</w:t>
       </w:r>
-      <w:proofErr w:type="spellEnd"/>
       <w:r>
         <w:rPr>
           <w:rFonts w:ascii="Consolas" w:eastAsia="Consolas" w:hAnsi="Consolas"/>
@@ -11568,8 +11376,6 @@
         </w:rPr>
         <w:t xml:space="preserve"> = </w:t>
       </w:r>
-      <w:proofErr w:type="spellStart"/>
-      <w:proofErr w:type="gramStart"/>
       <w:r>
         <w:rPr>
           <w:rFonts w:ascii="Consolas" w:eastAsia="Consolas" w:hAnsi="Consolas"/>
@@ -11577,7 +11383,6 @@
         </w:rPr>
         <w:t>payload.sensor</w:t>
       </w:r>
-      <w:proofErr w:type="gramEnd"/>
       <w:r>
         <w:rPr>
           <w:rFonts w:ascii="Consolas" w:eastAsia="Consolas" w:hAnsi="Consolas"/>
@@ -11585,7 +11390,6 @@
         </w:rPr>
         <w:t>_type_id</w:t>
       </w:r>
-      <w:proofErr w:type="spellEnd"/>
     </w:p>
     <w:p>
       <w:pPr>
@@ -11672,8 +11476,6 @@
           <w:lang w:val="ru-RU"/>
         </w:rPr>
       </w:pPr>
-      <w:proofErr w:type="spellStart"/>
-      <w:proofErr w:type="gramStart"/>
       <w:r>
         <w:rPr>
           <w:rFonts w:ascii="Consolas" w:eastAsia="Consolas" w:hAnsi="Consolas"/>
@@ -11681,7 +11483,6 @@
         </w:rPr>
         <w:t>db</w:t>
       </w:r>
-      <w:proofErr w:type="spellEnd"/>
       <w:r>
         <w:rPr>
           <w:rFonts w:ascii="Consolas" w:eastAsia="Consolas" w:hAnsi="Consolas"/>
@@ -11697,7 +11498,6 @@
         </w:rPr>
         <w:t>refresh</w:t>
       </w:r>
-      <w:proofErr w:type="gramEnd"/>
       <w:r>
         <w:rPr>
           <w:rFonts w:ascii="Consolas" w:eastAsia="Consolas" w:hAnsi="Consolas"/>
@@ -11803,7 +11603,6 @@
         <w:ind w:left="142" w:right="57" w:firstLine="0"/>
         <w:jc w:val="left"/>
       </w:pPr>
-      <w:proofErr w:type="spellStart"/>
       <w:r>
         <w:rPr>
           <w:rFonts w:ascii="Consolas" w:eastAsia="Consolas" w:hAnsi="Consolas"/>
@@ -11811,7 +11610,6 @@
         </w:rPr>
         <w:t>has_measurements</w:t>
       </w:r>
-      <w:proofErr w:type="spellEnd"/>
       <w:r>
         <w:rPr>
           <w:rFonts w:ascii="Consolas" w:eastAsia="Consolas" w:hAnsi="Consolas"/>
@@ -11819,8 +11617,6 @@
         </w:rPr>
         <w:t xml:space="preserve"> = </w:t>
       </w:r>
-      <w:proofErr w:type="spellStart"/>
-      <w:proofErr w:type="gramStart"/>
       <w:r>
         <w:rPr>
           <w:rFonts w:ascii="Consolas" w:eastAsia="Consolas" w:hAnsi="Consolas"/>
@@ -11828,8 +11624,6 @@
         </w:rPr>
         <w:t>db.scalar</w:t>
       </w:r>
-      <w:proofErr w:type="spellEnd"/>
-      <w:proofErr w:type="gramEnd"/>
       <w:r>
         <w:rPr>
           <w:rFonts w:ascii="Consolas" w:eastAsia="Consolas" w:hAnsi="Consolas"/>
@@ -12054,7 +11848,6 @@
         <w:ind w:left="142" w:right="57" w:firstLine="0"/>
         <w:jc w:val="left"/>
       </w:pPr>
-      <w:proofErr w:type="spellStart"/>
       <w:r>
         <w:rPr>
           <w:rFonts w:ascii="Consolas" w:eastAsia="Consolas" w:hAnsi="Consolas"/>
@@ -12062,7 +11855,6 @@
         </w:rPr>
         <w:t>stmt</w:t>
       </w:r>
-      <w:proofErr w:type="spellEnd"/>
       <w:r>
         <w:rPr>
           <w:rFonts w:ascii="Consolas" w:eastAsia="Consolas" w:hAnsi="Consolas"/>
@@ -12587,35 +12379,27 @@
         <w:lastRenderedPageBreak/>
         <w:t xml:space="preserve">количество созданных измерений и количество пропущенных значений. </w:t>
       </w:r>
-      <w:proofErr w:type="spellStart"/>
       <w:r>
         <w:t>Также</w:t>
       </w:r>
-      <w:proofErr w:type="spellEnd"/>
       <w:r>
         <w:t xml:space="preserve"> </w:t>
       </w:r>
-      <w:proofErr w:type="spellStart"/>
       <w:r>
         <w:t>есть</w:t>
       </w:r>
-      <w:proofErr w:type="spellEnd"/>
       <w:r>
         <w:t xml:space="preserve"> </w:t>
       </w:r>
-      <w:proofErr w:type="spellStart"/>
       <w:r>
         <w:t>кнопки</w:t>
       </w:r>
-      <w:proofErr w:type="spellEnd"/>
       <w:r>
         <w:t xml:space="preserve"> </w:t>
       </w:r>
-      <w:proofErr w:type="spellStart"/>
       <w:r>
         <w:t>перехода</w:t>
       </w:r>
-      <w:proofErr w:type="spellEnd"/>
       <w:r>
         <w:t xml:space="preserve"> к измерениям и графикам.</w:t>
       </w:r>
@@ -12709,59 +12493,45 @@
         </w:rPr>
         <w:t xml:space="preserve">-файла или значение «Введено вручную». </w:t>
       </w:r>
-      <w:proofErr w:type="spellStart"/>
       <w:r>
         <w:t>Для</w:t>
       </w:r>
-      <w:proofErr w:type="spellEnd"/>
       <w:r>
         <w:t xml:space="preserve"> </w:t>
       </w:r>
-      <w:proofErr w:type="spellStart"/>
       <w:r>
         <w:t>каждой</w:t>
       </w:r>
-      <w:proofErr w:type="spellEnd"/>
       <w:r>
         <w:t xml:space="preserve"> </w:t>
       </w:r>
-      <w:proofErr w:type="spellStart"/>
       <w:r>
         <w:t>строки</w:t>
       </w:r>
-      <w:proofErr w:type="spellEnd"/>
       <w:r>
         <w:t xml:space="preserve"> </w:t>
       </w:r>
-      <w:proofErr w:type="spellStart"/>
       <w:r>
         <w:t>доступны</w:t>
       </w:r>
-      <w:proofErr w:type="spellEnd"/>
       <w:r>
         <w:t xml:space="preserve"> </w:t>
       </w:r>
-      <w:proofErr w:type="spellStart"/>
       <w:r>
         <w:t>кнопки</w:t>
       </w:r>
-      <w:proofErr w:type="spellEnd"/>
       <w:r>
         <w:t xml:space="preserve"> </w:t>
       </w:r>
-      <w:proofErr w:type="spellStart"/>
       <w:r>
         <w:t>редактирования</w:t>
       </w:r>
-      <w:proofErr w:type="spellEnd"/>
       <w:r>
         <w:t xml:space="preserve"> и </w:t>
       </w:r>
-      <w:proofErr w:type="spellStart"/>
       <w:r>
         <w:t>удаления</w:t>
       </w:r>
-      <w:proofErr w:type="spellEnd"/>
       <w:r>
         <w:t>.</w:t>
       </w:r>
@@ -13009,35 +12779,27 @@
         </w:rPr>
         <w:t xml:space="preserve">На странице графиков первый режим предназначен для анализа нескольких показателей на одном полигоне. Пользователь выбирает полигон, несколько типов показателей, период и режим агрегации. </w:t>
       </w:r>
-      <w:proofErr w:type="spellStart"/>
       <w:r>
         <w:t>График</w:t>
       </w:r>
-      <w:proofErr w:type="spellEnd"/>
       <w:r>
         <w:t xml:space="preserve"> </w:t>
       </w:r>
-      <w:proofErr w:type="spellStart"/>
       <w:r>
         <w:t>отображает</w:t>
       </w:r>
-      <w:proofErr w:type="spellEnd"/>
       <w:r>
         <w:t xml:space="preserve"> </w:t>
       </w:r>
-      <w:proofErr w:type="spellStart"/>
       <w:r>
         <w:t>отдельную</w:t>
       </w:r>
-      <w:proofErr w:type="spellEnd"/>
       <w:r>
         <w:t xml:space="preserve"> </w:t>
       </w:r>
-      <w:proofErr w:type="spellStart"/>
       <w:r>
         <w:t>линию</w:t>
       </w:r>
-      <w:proofErr w:type="spellEnd"/>
       <w:r>
         <w:t xml:space="preserve"> для каждого выбранного показателя.</w:t>
       </w:r>
@@ -13210,35 +12972,27 @@
         </w:rPr>
         <w:t xml:space="preserve">Страница справочников содержит вкладки для полигонов, типов показателей и единиц измерения. На каждой вкладке есть форма создания или редактирования записи, таблица существующих записей и кнопки действий. Для полигонов отображаются название, локация и описание. Для типов показателей отображаются название, код, единица измерения и описание. </w:t>
       </w:r>
-      <w:proofErr w:type="spellStart"/>
       <w:r>
         <w:t>Для</w:t>
       </w:r>
-      <w:proofErr w:type="spellEnd"/>
       <w:r>
         <w:t xml:space="preserve"> </w:t>
       </w:r>
-      <w:proofErr w:type="spellStart"/>
       <w:r>
         <w:t>единиц</w:t>
       </w:r>
-      <w:proofErr w:type="spellEnd"/>
       <w:r>
         <w:t xml:space="preserve"> </w:t>
       </w:r>
-      <w:proofErr w:type="spellStart"/>
       <w:r>
         <w:t>измерения</w:t>
       </w:r>
-      <w:proofErr w:type="spellEnd"/>
       <w:r>
         <w:t xml:space="preserve"> </w:t>
       </w:r>
-      <w:proofErr w:type="spellStart"/>
       <w:r>
         <w:t>отображаются</w:t>
       </w:r>
-      <w:proofErr w:type="spellEnd"/>
       <w:r>
         <w:t xml:space="preserve"> название, символ и описание.</w:t>
       </w:r>
@@ -13572,35 +13326,27 @@
           <w:lang w:val="ru-RU"/>
         </w:rPr>
       </w:pPr>
-      <w:proofErr w:type="spellStart"/>
       <w:r>
         <w:t>Спроектирована</w:t>
       </w:r>
-      <w:proofErr w:type="spellEnd"/>
       <w:r>
         <w:t xml:space="preserve"> </w:t>
       </w:r>
-      <w:proofErr w:type="spellStart"/>
       <w:r>
         <w:t>структура</w:t>
       </w:r>
-      <w:proofErr w:type="spellEnd"/>
       <w:r>
         <w:t xml:space="preserve"> </w:t>
       </w:r>
-      <w:proofErr w:type="spellStart"/>
       <w:r>
         <w:t>из</w:t>
       </w:r>
-      <w:proofErr w:type="spellEnd"/>
       <w:r>
         <w:t xml:space="preserve"> </w:t>
       </w:r>
-      <w:proofErr w:type="spellStart"/>
       <w:r>
         <w:t>таблиц</w:t>
       </w:r>
-      <w:proofErr w:type="spellEnd"/>
       <w:r>
         <w:t xml:space="preserve"> polygons, data_collectors, measurement_units, sensor_types, import_files и measurements. ER</w:t>
       </w:r>
@@ -13758,7 +13504,6 @@
       <w:pPr>
         <w:pStyle w:val="1"/>
       </w:pPr>
-      <w:proofErr w:type="spellStart"/>
       <w:r>
         <w:rPr>
           <w:rFonts w:ascii="Times New Roman" w:eastAsia="Times New Roman" w:hAnsi="Times New Roman"/>
@@ -13766,28 +13511,24 @@
         <w:lastRenderedPageBreak/>
         <w:t>Список</w:t>
       </w:r>
-      <w:proofErr w:type="spellEnd"/>
       <w:r>
         <w:rPr>
           <w:rFonts w:ascii="Times New Roman" w:eastAsia="Times New Roman" w:hAnsi="Times New Roman"/>
         </w:rPr>
         <w:t xml:space="preserve"> </w:t>
       </w:r>
-      <w:proofErr w:type="spellStart"/>
       <w:r>
         <w:rPr>
           <w:rFonts w:ascii="Times New Roman" w:eastAsia="Times New Roman" w:hAnsi="Times New Roman"/>
         </w:rPr>
         <w:t>использованных</w:t>
       </w:r>
-      <w:proofErr w:type="spellEnd"/>
       <w:r>
         <w:rPr>
           <w:rFonts w:ascii="Times New Roman" w:eastAsia="Times New Roman" w:hAnsi="Times New Roman"/>
         </w:rPr>
         <w:t xml:space="preserve"> </w:t>
       </w:r>
-      <w:proofErr w:type="spellStart"/>
       <w:r>
         <w:rPr>
           <w:rFonts w:ascii="Times New Roman" w:eastAsia="Times New Roman" w:hAnsi="Times New Roman"/>
@@ -13795,7 +13536,6 @@
         <w:t>источников</w:t>
       </w:r>
       <w:bookmarkEnd w:id="31"/>
-      <w:proofErr w:type="spellEnd"/>
     </w:p>
     <w:p>
       <w:pPr>
@@ -13860,14 +13600,12 @@
           <w:lang w:val="ru-RU"/>
         </w:rPr>
       </w:pPr>
-      <w:proofErr w:type="spellStart"/>
       <w:r>
         <w:rPr>
           <w:lang w:val="ru-RU"/>
         </w:rPr>
         <w:t>Дейт</w:t>
       </w:r>
-      <w:proofErr w:type="spellEnd"/>
       <w:r>
         <w:rPr>
           <w:lang w:val="ru-RU"/>
@@ -13882,28 +13620,24 @@
           <w:lang w:val="ru-RU"/>
         </w:rPr>
       </w:pPr>
-      <w:proofErr w:type="spellStart"/>
       <w:r>
         <w:rPr>
           <w:lang w:val="ru-RU"/>
         </w:rPr>
         <w:t>Силбершац</w:t>
       </w:r>
-      <w:proofErr w:type="spellEnd"/>
       <w:r>
         <w:rPr>
           <w:lang w:val="ru-RU"/>
         </w:rPr>
         <w:t xml:space="preserve"> А., Корт Г., </w:t>
       </w:r>
-      <w:proofErr w:type="spellStart"/>
       <w:r>
         <w:rPr>
           <w:lang w:val="ru-RU"/>
         </w:rPr>
         <w:t>Сударшан</w:t>
       </w:r>
-      <w:proofErr w:type="spellEnd"/>
       <w:r>
         <w:rPr>
           <w:lang w:val="ru-RU"/>
@@ -14226,7 +13960,7 @@
         <w:rFonts w:asciiTheme="minorHAnsi" w:eastAsiaTheme="minorEastAsia" w:hAnsiTheme="minorHAnsi" w:cstheme="minorBidi"/>
         <w:sz w:val="22"/>
         <w:szCs w:val="22"/>
-        <w:lang w:val="en-US" w:eastAsia="en-US" w:bidi="ar-SA"/>
+        <w:lang w:val="ru-RU" w:eastAsia="ru-RU" w:bidi="ru-RU"/>
       </w:rPr>
     </w:rPrDefault>
     <w:pPrDefault>

</xml_diff>